<commit_message>
finished lesson on GitReferences, updated TOC in intermediate
</commit_message>
<xml_diff>
--- a/Intermediate/WordFileVersions/GitReferences.docx
+++ b/Intermediate/WordFileVersions/GitReferences.docx
@@ -302,6 +302,9 @@
     </w:p>
     <w:p>
       <w:r>
+        <w:rPr>
+          <w:noProof/>
+        </w:rPr>
         <w:drawing>
           <wp:inline distT="0" distB="0" distL="0" distR="0" wp14:anchorId="33913E8F" wp14:editId="3B48856C">
             <wp:extent cx="5943600" cy="1388110"/>
@@ -736,10 +739,7 @@
         <w:sym w:font="Wingdings" w:char="F0E0"/>
       </w:r>
       <w:r>
-        <w:t xml:space="preserve"> </w:t>
-      </w:r>
-      <w:r>
-        <w:t>F</w:t>
+        <w:t xml:space="preserve"> F</w:t>
       </w:r>
     </w:p>
     <w:p>
@@ -794,6 +794,9 @@
     </w:p>
     <w:p>
       <w:r>
+        <w:rPr>
+          <w:noProof/>
+        </w:rPr>
         <w:drawing>
           <wp:inline distT="0" distB="0" distL="0" distR="0" wp14:anchorId="4CD738EA" wp14:editId="1CEF7F52">
             <wp:extent cx="5943600" cy="1701165"/>
@@ -914,6 +917,1209 @@
           <w:bottom w:val="single" w:sz="12" w:space="1" w:color="auto"/>
         </w:pBdr>
       </w:pPr>
+    </w:p>
+    <w:p>
+      <w:pPr>
+        <w:pStyle w:val="Heading2"/>
+      </w:pPr>
+      <w:r>
+        <w:t>What is HEAD?</w:t>
+      </w:r>
+    </w:p>
+    <w:p>
+      <w:r>
+        <w:t xml:space="preserve">HEAD is the most important reference in Git. It tells Git where you are currently working within the repository’s commit history. </w:t>
+      </w:r>
+      <w:r>
+        <w:t>Many Git operations that create a commit, compare changes, switch branches, or otherwise interact with the repository history use HEAD to determine your current location in history</w:t>
+      </w:r>
+      <w:r>
+        <w:t>.</w:t>
+      </w:r>
+    </w:p>
+    <w:p>
+      <w:r>
+        <w:t>Most of the time, HEAD does not point directly to a commit</w:t>
+      </w:r>
+      <w:r>
+        <w:t>,</w:t>
+      </w:r>
+      <w:r>
+        <w:t xml:space="preserve"> although it can. </w:t>
+      </w:r>
+      <w:r>
+        <w:t>Typically,</w:t>
+      </w:r>
+      <w:r>
+        <w:t xml:space="preserve"> though, it points to the current branch and that current branch then points to the latest commit within that line of development. If you had a repository with a single branch named main and a commit history of A </w:t>
+      </w:r>
+      <w:r>
+        <w:sym w:font="Wingdings" w:char="F0DF"/>
+      </w:r>
+      <w:r>
+        <w:t xml:space="preserve"> B </w:t>
+      </w:r>
+      <w:r>
+        <w:sym w:font="Wingdings" w:char="F0DF"/>
+      </w:r>
+      <w:r>
+        <w:t xml:space="preserve"> C, the references may look something like:</w:t>
+      </w:r>
+    </w:p>
+    <w:p>
+      <w:r>
+        <w:lastRenderedPageBreak/>
+        <w:t xml:space="preserve">HEAD </w:t>
+      </w:r>
+      <w:r>
+        <w:sym w:font="Wingdings" w:char="F0E0"/>
+      </w:r>
+      <w:r>
+        <w:t xml:space="preserve"> main </w:t>
+      </w:r>
+      <w:r>
+        <w:sym w:font="Wingdings" w:char="F0E0"/>
+      </w:r>
+      <w:r>
+        <w:t xml:space="preserve"> Commit C</w:t>
+      </w:r>
+    </w:p>
+    <w:p>
+      <w:r>
+        <w:t xml:space="preserve">In this example, HEAD points to main as the current branch being worked on and as we learned in </w:t>
+      </w:r>
+      <w:r>
+        <w:t>the previous section</w:t>
+      </w:r>
+      <w:r>
+        <w:t xml:space="preserve">, main is a reference to the latest commit on that line of development. </w:t>
+      </w:r>
+      <w:r>
+        <w:t>Since HEAD points to main, whenever a new commit is created on the branch, Git automatically updates the main reference to the newest commit. Consequently, since HEAD points to main, HEAD automatically references the newest commit on that branch</w:t>
+      </w:r>
+      <w:r>
+        <w:t xml:space="preserve"> through its reference to main</w:t>
+      </w:r>
+      <w:r>
+        <w:t>.</w:t>
+      </w:r>
+    </w:p>
+    <w:p>
+      <w:r>
+        <w:t xml:space="preserve">You can see what HEAD </w:t>
+      </w:r>
+      <w:proofErr w:type="gramStart"/>
+      <w:r>
+        <w:t>is referencing</w:t>
+      </w:r>
+      <w:proofErr w:type="gramEnd"/>
+      <w:r>
+        <w:t xml:space="preserve"> by using the command </w:t>
+      </w:r>
+      <w:r>
+        <w:t>we used prior `git log --graph --</w:t>
+      </w:r>
+      <w:proofErr w:type="spellStart"/>
+      <w:r>
+        <w:t>oneline</w:t>
+      </w:r>
+      <w:proofErr w:type="spellEnd"/>
+      <w:r>
+        <w:t xml:space="preserve"> --all`. In the output we can clearly see the reference of HEAD </w:t>
+      </w:r>
+      <w:r>
+        <w:sym w:font="Wingdings" w:char="F0E0"/>
+      </w:r>
+      <w:r>
+        <w:t xml:space="preserve"> main. Additionally, we can also go to </w:t>
+      </w:r>
+      <w:proofErr w:type="gramStart"/>
+      <w:r>
+        <w:t>`.git</w:t>
+      </w:r>
+      <w:proofErr w:type="gramEnd"/>
+      <w:r>
+        <w:t xml:space="preserve">/refs/heads` in the repository’s directory and see a file named `main`, which has the commit’s hash identifier </w:t>
+      </w:r>
+      <w:r>
+        <w:t>that main currently is referencing.</w:t>
+      </w:r>
+    </w:p>
+    <w:p>
+      <w:r>
+        <w:rPr>
+          <w:noProof/>
+        </w:rPr>
+        <w:drawing>
+          <wp:inline distT="0" distB="0" distL="0" distR="0" wp14:anchorId="11F7A311" wp14:editId="39952055">
+            <wp:extent cx="5943600" cy="1388110"/>
+            <wp:effectExtent l="0" t="0" r="0" b="2540"/>
+            <wp:docPr id="1170990225" name="Picture 1"/>
+            <wp:cNvGraphicFramePr>
+              <a:graphicFrameLocks xmlns:a="http://schemas.openxmlformats.org/drawingml/2006/main" noChangeAspect="1"/>
+            </wp:cNvGraphicFramePr>
+            <a:graphic xmlns:a="http://schemas.openxmlformats.org/drawingml/2006/main">
+              <a:graphicData uri="http://schemas.openxmlformats.org/drawingml/2006/picture">
+                <pic:pic xmlns:pic="http://schemas.openxmlformats.org/drawingml/2006/picture">
+                  <pic:nvPicPr>
+                    <pic:cNvPr id="220302333" name=""/>
+                    <pic:cNvPicPr/>
+                  </pic:nvPicPr>
+                  <pic:blipFill>
+                    <a:blip r:embed="rId5"/>
+                    <a:stretch>
+                      <a:fillRect/>
+                    </a:stretch>
+                  </pic:blipFill>
+                  <pic:spPr>
+                    <a:xfrm>
+                      <a:off x="0" y="0"/>
+                      <a:ext cx="5943600" cy="1388110"/>
+                    </a:xfrm>
+                    <a:prstGeom prst="rect">
+                      <a:avLst/>
+                    </a:prstGeom>
+                  </pic:spPr>
+                </pic:pic>
+              </a:graphicData>
+            </a:graphic>
+          </wp:inline>
+        </w:drawing>
+      </w:r>
+    </w:p>
+    <w:p>
+      <w:r>
+        <w:rPr>
+          <w:noProof/>
+        </w:rPr>
+        <w:drawing>
+          <wp:inline distT="0" distB="0" distL="0" distR="0" wp14:anchorId="0B742607" wp14:editId="065B5763">
+            <wp:extent cx="5943600" cy="1701165"/>
+            <wp:effectExtent l="0" t="0" r="0" b="0"/>
+            <wp:docPr id="1758693618" name="Picture 1"/>
+            <wp:cNvGraphicFramePr>
+              <a:graphicFrameLocks xmlns:a="http://schemas.openxmlformats.org/drawingml/2006/main" noChangeAspect="1"/>
+            </wp:cNvGraphicFramePr>
+            <a:graphic xmlns:a="http://schemas.openxmlformats.org/drawingml/2006/main">
+              <a:graphicData uri="http://schemas.openxmlformats.org/drawingml/2006/picture">
+                <pic:pic xmlns:pic="http://schemas.openxmlformats.org/drawingml/2006/picture">
+                  <pic:nvPicPr>
+                    <pic:cNvPr id="1325294101" name=""/>
+                    <pic:cNvPicPr/>
+                  </pic:nvPicPr>
+                  <pic:blipFill>
+                    <a:blip r:embed="rId6"/>
+                    <a:stretch>
+                      <a:fillRect/>
+                    </a:stretch>
+                  </pic:blipFill>
+                  <pic:spPr>
+                    <a:xfrm>
+                      <a:off x="0" y="0"/>
+                      <a:ext cx="5943600" cy="1701165"/>
+                    </a:xfrm>
+                    <a:prstGeom prst="rect">
+                      <a:avLst/>
+                    </a:prstGeom>
+                  </pic:spPr>
+                </pic:pic>
+              </a:graphicData>
+            </a:graphic>
+          </wp:inline>
+        </w:drawing>
+      </w:r>
+    </w:p>
+    <w:p>
+      <w:r>
+        <w:t>Although this is the most common behavior of HEAD, it is not always attached to a branch. HEAD can point directly to a commit instead and this is known as a detached HEAD state. We will cover this later in this guide.</w:t>
+      </w:r>
+      <w:r>
+        <w:t xml:space="preserve"> </w:t>
+      </w:r>
+    </w:p>
+    <w:p>
+      <w:pPr>
+        <w:pBdr>
+          <w:bottom w:val="single" w:sz="12" w:space="1" w:color="auto"/>
+        </w:pBdr>
+      </w:pPr>
+    </w:p>
+    <w:p>
+      <w:pPr>
+        <w:pStyle w:val="Heading2"/>
+      </w:pPr>
+      <w:r>
+        <w:t>Symbolic References</w:t>
+      </w:r>
+    </w:p>
+    <w:p>
+      <w:r>
+        <w:t xml:space="preserve">In the last section, we learned that HEAD does not usually point directly to a commit. Instead, HEAD points to </w:t>
+      </w:r>
+      <w:r>
+        <w:t>another reference, usually a branch, and that branch points to a commit</w:t>
+      </w:r>
+      <w:r>
+        <w:t>. This</w:t>
+      </w:r>
+      <w:r>
+        <w:t xml:space="preserve"> relationship is known as </w:t>
+      </w:r>
+      <w:r>
+        <w:t>a symbolic reference</w:t>
+      </w:r>
+      <w:r>
+        <w:t xml:space="preserve"> because one reference points </w:t>
+      </w:r>
+      <w:r>
+        <w:lastRenderedPageBreak/>
+        <w:t xml:space="preserve">to another reference </w:t>
+      </w:r>
+      <w:r>
+        <w:t>rather</w:t>
+      </w:r>
+      <w:r>
+        <w:t xml:space="preserve"> than directly pointing to a Git object. </w:t>
+      </w:r>
+      <w:r>
+        <w:t>For example, if we have a repository with a branch named main, the reference chain would look like:</w:t>
+      </w:r>
+    </w:p>
+    <w:p>
+      <w:r>
+        <w:t xml:space="preserve">HEAD </w:t>
+      </w:r>
+      <w:r>
+        <w:sym w:font="Wingdings" w:char="F0E0"/>
+      </w:r>
+      <w:r>
+        <w:t xml:space="preserve"> refs/heads/main </w:t>
+      </w:r>
+      <w:r>
+        <w:sym w:font="Wingdings" w:char="F0E0"/>
+      </w:r>
+      <w:r>
+        <w:t xml:space="preserve"> </w:t>
+      </w:r>
+      <w:r>
+        <w:t xml:space="preserve">hash of commit B </w:t>
+      </w:r>
+      <w:r>
+        <w:sym w:font="Wingdings" w:char="F0E0"/>
+      </w:r>
+      <w:r>
+        <w:t xml:space="preserve"> </w:t>
+      </w:r>
+      <w:r>
+        <w:t>Commit B.</w:t>
+      </w:r>
+    </w:p>
+    <w:p>
+      <w:r>
+        <w:t>In this example, HEAD is not directly pointing to Commit B but instead pointing to the main branch. The main branch is then pointing to Commit B using the hash identifier of Commit B stored in refs/heads/main.</w:t>
+      </w:r>
+      <w:r>
+        <w:t xml:space="preserve"> </w:t>
+      </w:r>
+    </w:p>
+    <w:p>
+      <w:r>
+        <w:t xml:space="preserve">We can observe this relationship by opening the </w:t>
+      </w:r>
+      <w:proofErr w:type="gramStart"/>
+      <w:r>
+        <w:t>`.git</w:t>
+      </w:r>
+      <w:proofErr w:type="gramEnd"/>
+      <w:r>
+        <w:t xml:space="preserve">/HEAD` file. Instead of containing a commit hash, this file contains the reference path of the branch currently being used. </w:t>
+      </w:r>
+    </w:p>
+    <w:p>
+      <w:r>
+        <w:drawing>
+          <wp:inline distT="0" distB="0" distL="0" distR="0" wp14:anchorId="19999D2B" wp14:editId="7465D97B">
+            <wp:extent cx="5943600" cy="2695575"/>
+            <wp:effectExtent l="0" t="0" r="0" b="9525"/>
+            <wp:docPr id="1065613911" name="Picture 1"/>
+            <wp:cNvGraphicFramePr>
+              <a:graphicFrameLocks xmlns:a="http://schemas.openxmlformats.org/drawingml/2006/main" noChangeAspect="1"/>
+            </wp:cNvGraphicFramePr>
+            <a:graphic xmlns:a="http://schemas.openxmlformats.org/drawingml/2006/main">
+              <a:graphicData uri="http://schemas.openxmlformats.org/drawingml/2006/picture">
+                <pic:pic xmlns:pic="http://schemas.openxmlformats.org/drawingml/2006/picture">
+                  <pic:nvPicPr>
+                    <pic:cNvPr id="1065613911" name=""/>
+                    <pic:cNvPicPr/>
+                  </pic:nvPicPr>
+                  <pic:blipFill>
+                    <a:blip r:embed="rId7"/>
+                    <a:stretch>
+                      <a:fillRect/>
+                    </a:stretch>
+                  </pic:blipFill>
+                  <pic:spPr>
+                    <a:xfrm>
+                      <a:off x="0" y="0"/>
+                      <a:ext cx="5943600" cy="2695575"/>
+                    </a:xfrm>
+                    <a:prstGeom prst="rect">
+                      <a:avLst/>
+                    </a:prstGeom>
+                  </pic:spPr>
+                </pic:pic>
+              </a:graphicData>
+            </a:graphic>
+          </wp:inline>
+        </w:drawing>
+      </w:r>
+    </w:p>
+    <w:p>
+      <w:r>
+        <w:t xml:space="preserve">If we were to create another branch named `development` and </w:t>
+      </w:r>
+      <w:proofErr w:type="gramStart"/>
+      <w:r>
+        <w:t>switched</w:t>
+      </w:r>
+      <w:proofErr w:type="gramEnd"/>
+      <w:r>
+        <w:t xml:space="preserve"> to that new branch, the HEAD file would be changed to reflect that HEAD now points to the `development` branch rather than the main branch. The file contents would now look like “ref: refs/heads/development”. </w:t>
+      </w:r>
+    </w:p>
+    <w:p>
+      <w:pPr>
+        <w:pBdr>
+          <w:bottom w:val="single" w:sz="12" w:space="1" w:color="auto"/>
+        </w:pBdr>
+      </w:pPr>
+      <w:r>
+        <w:t xml:space="preserve">However, symbolic references are not limited to just HEAD. Git uses symbolic references internally </w:t>
+      </w:r>
+      <w:r>
+        <w:t>whenever one reference needs to point to another reference instead of directly pointing to a Git object</w:t>
+      </w:r>
+      <w:r>
+        <w:t>.</w:t>
+      </w:r>
+    </w:p>
+    <w:p>
+      <w:pPr>
+        <w:pBdr>
+          <w:bottom w:val="single" w:sz="12" w:space="1" w:color="auto"/>
+        </w:pBdr>
+      </w:pPr>
+    </w:p>
+    <w:p>
+      <w:pPr>
+        <w:pStyle w:val="Heading2"/>
+      </w:pPr>
+      <w:r>
+        <w:t>Direct References</w:t>
+      </w:r>
+    </w:p>
+    <w:p>
+      <w:r>
+        <w:t xml:space="preserve">In contrast to a symbolic reference, a direct reference </w:t>
+      </w:r>
+      <w:r>
+        <w:t>points directly to a Git object rather than another reference</w:t>
+      </w:r>
+      <w:r>
+        <w:t xml:space="preserve">. </w:t>
+      </w:r>
+      <w:r>
+        <w:t>The most common example is when HEAD points directly to a commit instead of a branch. This is known as a detached HEAD state because HEAD no longer references a branch before pointing to a commit.</w:t>
+      </w:r>
+    </w:p>
+    <w:p>
+      <w:r>
+        <w:lastRenderedPageBreak/>
+        <w:t xml:space="preserve">The </w:t>
+      </w:r>
+      <w:proofErr w:type="gramStart"/>
+      <w:r>
+        <w:t>`.git</w:t>
+      </w:r>
+      <w:proofErr w:type="gramEnd"/>
+      <w:r>
+        <w:t>/HEAD` file would now contain the commit hash identifier for the commit being referenced instead of the `ref: refs/heads/main` reference we saw earlier. Working from a detached HEAD state allows you to experiment with or inspect older commits, but it changes how new commits are tracked. We will explore this later!</w:t>
+      </w:r>
+    </w:p>
+    <w:p>
+      <w:pPr>
+        <w:pBdr>
+          <w:bottom w:val="single" w:sz="12" w:space="1" w:color="auto"/>
+        </w:pBdr>
+      </w:pPr>
+    </w:p>
+    <w:p>
+      <w:pPr>
+        <w:pStyle w:val="Heading2"/>
+      </w:pPr>
+      <w:r>
+        <w:t>Understanding Tags</w:t>
+      </w:r>
+    </w:p>
+    <w:p>
+      <w:r>
+        <w:t>Building off previous sections, we have learned that branches are simply</w:t>
+      </w:r>
+      <w:r>
+        <w:t xml:space="preserve"> </w:t>
+      </w:r>
+      <w:r>
+        <w:t>pointer</w:t>
+      </w:r>
+      <w:r>
+        <w:t>s</w:t>
+      </w:r>
+      <w:r>
+        <w:t xml:space="preserve"> that reference Git commit objects.</w:t>
+      </w:r>
+      <w:r>
+        <w:t xml:space="preserve"> However, branches are designed to move as new commits are created. Every time a new commit is created on a branch, Git automatically updates the branch reference to point to the new commit.</w:t>
+      </w:r>
+    </w:p>
+    <w:p>
+      <w:r>
+        <w:t xml:space="preserve">Tags are another type of reference in Git, but unlike branches, tags are designed to mark a specific point in the repository’s history and </w:t>
+      </w:r>
+      <w:r>
+        <w:t xml:space="preserve">typically </w:t>
+      </w:r>
+      <w:r>
+        <w:t xml:space="preserve">do not move after they are created. Why would we want a reference that </w:t>
+      </w:r>
+      <w:r>
+        <w:t>is designed not to be</w:t>
+      </w:r>
+      <w:r>
+        <w:t xml:space="preserve"> moved once created? Great question!</w:t>
+      </w:r>
+    </w:p>
+    <w:p>
+      <w:r>
+        <w:t>Suppose we have a repository for an application on a single branch `main`</w:t>
+      </w:r>
+      <w:r>
+        <w:t xml:space="preserve"> </w:t>
+      </w:r>
+      <w:r>
+        <w:t>and the commit history looks something like:</w:t>
+      </w:r>
+    </w:p>
+    <w:p>
+      <w:r>
+        <w:t xml:space="preserve">A </w:t>
+      </w:r>
+      <w:r>
+        <w:sym w:font="Wingdings" w:char="F0DF"/>
+      </w:r>
+      <w:r>
+        <w:t xml:space="preserve"> B </w:t>
+      </w:r>
+      <w:r>
+        <w:sym w:font="Wingdings" w:char="F0DF"/>
+      </w:r>
+      <w:r>
+        <w:t xml:space="preserve"> C </w:t>
+      </w:r>
+      <w:r>
+        <w:sym w:font="Wingdings" w:char="F0DF"/>
+      </w:r>
+      <w:r>
+        <w:t xml:space="preserve"> D </w:t>
+      </w:r>
+      <w:r>
+        <w:sym w:font="Wingdings" w:char="F0DF"/>
+      </w:r>
+      <w:r>
+        <w:t xml:space="preserve"> E</w:t>
+      </w:r>
+    </w:p>
+    <w:p>
+      <w:r>
+        <w:t xml:space="preserve">Let’s say after </w:t>
+      </w:r>
+      <w:proofErr w:type="gramStart"/>
+      <w:r>
+        <w:t>commit</w:t>
+      </w:r>
+      <w:proofErr w:type="gramEnd"/>
+      <w:r>
+        <w:t xml:space="preserve"> E, we have decided that our application is in working order and can be released to the public to try. Hurray! We have our 1.0 launch; how may we mark this point in the history of our application’s repository? Well with a tag of course!</w:t>
+      </w:r>
+    </w:p>
+    <w:p>
+      <w:r>
+        <w:t>We could name the tag `v1.0` and have that tag reference commit E. Now our references currently look something like:</w:t>
+      </w:r>
+    </w:p>
+    <w:p>
+      <w:r>
+        <w:t xml:space="preserve">main </w:t>
+      </w:r>
+      <w:r>
+        <w:sym w:font="Wingdings" w:char="F0E0"/>
+      </w:r>
+      <w:r>
+        <w:t xml:space="preserve"> commit E</w:t>
+      </w:r>
+    </w:p>
+    <w:p>
+      <w:r>
+        <w:t xml:space="preserve">v1.0 </w:t>
+      </w:r>
+      <w:r>
+        <w:sym w:font="Wingdings" w:char="F0E0"/>
+      </w:r>
+      <w:r>
+        <w:t xml:space="preserve"> commit E</w:t>
+      </w:r>
+    </w:p>
+    <w:p>
+      <w:r>
+        <w:t>If we were to then continue our development of the application and make a commit F after commit E, our references would look like:</w:t>
+      </w:r>
+    </w:p>
+    <w:p>
+      <w:r>
+        <w:t xml:space="preserve">main </w:t>
+      </w:r>
+      <w:r>
+        <w:sym w:font="Wingdings" w:char="F0E0"/>
+      </w:r>
+      <w:r>
+        <w:t xml:space="preserve"> commit F</w:t>
+      </w:r>
+    </w:p>
+    <w:p>
+      <w:r>
+        <w:t xml:space="preserve">v1.0 </w:t>
+      </w:r>
+      <w:r>
+        <w:sym w:font="Wingdings" w:char="F0E0"/>
+      </w:r>
+      <w:r>
+        <w:t xml:space="preserve"> commit E</w:t>
+      </w:r>
+    </w:p>
+    <w:p>
+      <w:r>
+        <w:t>This is because main will point to the new commit and the tag will remain the same as it does not change. Later, when we release new versions of the application, we can create more tags and be able to see where the full releases of the application were in history.</w:t>
+      </w:r>
+    </w:p>
+    <w:p>
+      <w:r>
+        <w:lastRenderedPageBreak/>
+        <w:t>This is useful because developers can quickly identify important milestones within a project’s history and easily return to the exact version of the application that existed at that time.</w:t>
+      </w:r>
+    </w:p>
+    <w:p>
+      <w:pPr>
+        <w:pBdr>
+          <w:bottom w:val="single" w:sz="12" w:space="1" w:color="auto"/>
+        </w:pBdr>
+      </w:pPr>
+    </w:p>
+    <w:p>
+      <w:pPr>
+        <w:pStyle w:val="Heading2"/>
+      </w:pPr>
+      <w:r>
+        <w:t>Lightweight vs Annotated Tags</w:t>
+      </w:r>
+    </w:p>
+    <w:p>
+      <w:r>
+        <w:t xml:space="preserve">Git provides two different types of tags for developers to use: lightweight and annotated tags. These two types of tags are similar in </w:t>
+      </w:r>
+      <w:r>
+        <w:t>purpose</w:t>
+      </w:r>
+      <w:r>
+        <w:t xml:space="preserve"> but are stored differently internally within Git</w:t>
+      </w:r>
+      <w:r>
+        <w:t>’s</w:t>
+      </w:r>
+      <w:r>
+        <w:t xml:space="preserve"> object database. A lightweight tag is simply a reference </w:t>
+      </w:r>
+      <w:r>
+        <w:t xml:space="preserve">that points </w:t>
+      </w:r>
+      <w:r>
+        <w:t>directly to a Git object, usually a commit. An annotated tag</w:t>
+      </w:r>
+      <w:r>
+        <w:t>,</w:t>
+      </w:r>
+      <w:r>
+        <w:t xml:space="preserve"> on the other hand</w:t>
+      </w:r>
+      <w:r>
+        <w:t>,</w:t>
+      </w:r>
+      <w:r>
+        <w:t xml:space="preserve"> </w:t>
+      </w:r>
+      <w:r>
+        <w:t>creates</w:t>
+      </w:r>
+      <w:r>
+        <w:t xml:space="preserve"> its own Git object </w:t>
+      </w:r>
+      <w:r>
+        <w:t>called a tag object. T</w:t>
+      </w:r>
+      <w:r>
+        <w:t xml:space="preserve">hat </w:t>
+      </w:r>
+      <w:r>
+        <w:t xml:space="preserve">tag object </w:t>
+      </w:r>
+      <w:r>
+        <w:t>stores additional metadata about the tag in addition to being a pointer to another Git object such as a commit.</w:t>
+      </w:r>
+    </w:p>
+    <w:p>
+      <w:r>
+        <w:t xml:space="preserve">A lightweight tag is the simplest </w:t>
+      </w:r>
+      <w:r>
+        <w:t xml:space="preserve">type </w:t>
+      </w:r>
+      <w:r>
+        <w:t xml:space="preserve">of </w:t>
+      </w:r>
+      <w:r>
+        <w:t>tag. I</w:t>
+      </w:r>
+      <w:r>
+        <w:t xml:space="preserve">t acts similarly to a branch reference </w:t>
+      </w:r>
+      <w:r>
+        <w:t xml:space="preserve">in that it is stored within the </w:t>
+      </w:r>
+      <w:proofErr w:type="gramStart"/>
+      <w:r>
+        <w:t>`.git</w:t>
+      </w:r>
+      <w:proofErr w:type="gramEnd"/>
+      <w:r>
+        <w:t>/refs` directory</w:t>
+      </w:r>
+      <w:r>
+        <w:t>.</w:t>
+      </w:r>
+      <w:r>
+        <w:t xml:space="preserve"> However, unlike a branch, Git does not automatically update a lightweight tag when new commits are created.</w:t>
+      </w:r>
+    </w:p>
+    <w:p>
+      <w:r>
+        <w:t xml:space="preserve">You can make a lightweight tag by using the command `git tag {insert tag </w:t>
+      </w:r>
+      <w:proofErr w:type="gramStart"/>
+      <w:r>
+        <w:t>name}`</w:t>
+      </w:r>
+      <w:proofErr w:type="gramEnd"/>
+      <w:r>
+        <w:t>. If we made the name of this tag be `v1.0`</w:t>
+      </w:r>
+      <w:r>
+        <w:t>, t</w:t>
+      </w:r>
+      <w:r>
+        <w:t xml:space="preserve">his would create a reference in the </w:t>
+      </w:r>
+      <w:proofErr w:type="gramStart"/>
+      <w:r>
+        <w:t>`.git</w:t>
+      </w:r>
+      <w:proofErr w:type="gramEnd"/>
+      <w:r>
+        <w:t>/refs/tags` directory</w:t>
+      </w:r>
+      <w:r>
+        <w:t>.</w:t>
+      </w:r>
+      <w:r>
+        <w:t xml:space="preserve"> </w:t>
+      </w:r>
+      <w:r>
+        <w:t>A</w:t>
+      </w:r>
+      <w:r>
+        <w:t xml:space="preserve"> file </w:t>
+      </w:r>
+      <w:r>
+        <w:t xml:space="preserve">named `v1.0` </w:t>
+      </w:r>
+      <w:r>
+        <w:t xml:space="preserve">would </w:t>
+      </w:r>
+      <w:r>
+        <w:t xml:space="preserve">then </w:t>
+      </w:r>
+      <w:r>
+        <w:t xml:space="preserve">be created that </w:t>
+      </w:r>
+      <w:r>
+        <w:t>contains</w:t>
+      </w:r>
+      <w:r>
+        <w:t xml:space="preserve"> the hash identifier </w:t>
+      </w:r>
+      <w:r>
+        <w:t xml:space="preserve">of the object </w:t>
+      </w:r>
+      <w:r>
+        <w:t xml:space="preserve">that the tag </w:t>
+      </w:r>
+      <w:r>
+        <w:t>points</w:t>
+      </w:r>
+      <w:r>
+        <w:t xml:space="preserve"> to. The tag would have been set to the commit that is </w:t>
+      </w:r>
+      <w:r>
+        <w:t xml:space="preserve">currently </w:t>
+      </w:r>
+      <w:r>
+        <w:t>pointed to</w:t>
+      </w:r>
+      <w:r>
+        <w:t xml:space="preserve"> by </w:t>
+      </w:r>
+      <w:r>
+        <w:t>HEAD</w:t>
+      </w:r>
+      <w:r>
+        <w:t>,</w:t>
+      </w:r>
+      <w:r>
+        <w:t xml:space="preserve"> as we did not give a specific commit in our command.</w:t>
+      </w:r>
+    </w:p>
+    <w:p>
+      <w:r>
+        <w:t xml:space="preserve">Annotated tags are a more </w:t>
+      </w:r>
+      <w:r>
+        <w:t>feature-rich</w:t>
+      </w:r>
+      <w:r>
+        <w:t xml:space="preserve"> type of tag in Git. Instead of just pointing directly to a commit, an annotated tag creates its own Git object called a tag object which stores </w:t>
+      </w:r>
+      <w:r>
+        <w:t xml:space="preserve">metadata </w:t>
+      </w:r>
+      <w:r>
+        <w:t>information</w:t>
+      </w:r>
+      <w:r>
+        <w:t xml:space="preserve"> about the tag. This information is the </w:t>
+      </w:r>
+      <w:r>
+        <w:t>tag name, tag message, tag author, creation timestamp, and optionally a cryptographic signature.</w:t>
+      </w:r>
+    </w:p>
+    <w:p>
+      <w:r>
+        <w:t>An annotated tag can be created with the command `git tag -a {tag name} -m “{tag message</w:t>
+      </w:r>
+      <w:proofErr w:type="gramStart"/>
+      <w:r>
+        <w:t>}”`</w:t>
+      </w:r>
+      <w:proofErr w:type="gramEnd"/>
+      <w:r>
+        <w:t xml:space="preserve">. The -a is </w:t>
+      </w:r>
+      <w:r>
+        <w:t>a flag</w:t>
+      </w:r>
+      <w:r>
+        <w:t xml:space="preserve"> that creates an annotated tag and the -m is a</w:t>
+      </w:r>
+      <w:r>
+        <w:t xml:space="preserve"> flag</w:t>
+      </w:r>
+      <w:r>
+        <w:t xml:space="preserve"> to be able to create a message for the tag.</w:t>
+      </w:r>
+    </w:p>
+    <w:p>
+      <w:r>
+        <w:t xml:space="preserve">You can still see an annotated tag in the </w:t>
+      </w:r>
+      <w:proofErr w:type="gramStart"/>
+      <w:r>
+        <w:t>`.git</w:t>
+      </w:r>
+      <w:proofErr w:type="gramEnd"/>
+      <w:r>
+        <w:t xml:space="preserve">/refs/tags` directory, but instead of containing the hash identifier of the commit </w:t>
+      </w:r>
+      <w:r>
+        <w:t>being referenced,</w:t>
+      </w:r>
+      <w:r>
+        <w:t xml:space="preserve"> we instead have the hash identifier of the tag object. The tag object would contain the hash identifier of the commit, but it would also contain the additional information we just discussed.</w:t>
+      </w:r>
+      <w:r>
+        <w:t xml:space="preserve"> The tag object itself is stored in the </w:t>
+      </w:r>
+      <w:proofErr w:type="gramStart"/>
+      <w:r>
+        <w:t>`.git</w:t>
+      </w:r>
+      <w:proofErr w:type="gramEnd"/>
+      <w:r>
+        <w:t>/objects` directory.</w:t>
+      </w:r>
+    </w:p>
+    <w:p>
+      <w:r>
+        <w:lastRenderedPageBreak/>
+        <w:t>If you view the file that contains the hash identifier of the tag object, and then use the command `git cat-file -p {insert hash identifier</w:t>
+      </w:r>
+      <w:r>
+        <w:t xml:space="preserve"> of tag </w:t>
+      </w:r>
+      <w:proofErr w:type="gramStart"/>
+      <w:r>
+        <w:t>object</w:t>
+      </w:r>
+      <w:r>
+        <w:t>}`</w:t>
+      </w:r>
+      <w:proofErr w:type="gramEnd"/>
+      <w:r>
+        <w:t>it would return the information of the tag and look something like:</w:t>
+      </w:r>
+    </w:p>
+    <w:p>
+      <w:r>
+        <w:t>“</w:t>
+      </w:r>
+    </w:p>
+    <w:p>
+      <w:r>
+        <w:t xml:space="preserve">object </w:t>
+      </w:r>
+      <w:r>
+        <w:t>a83f91b2d4e8f7c...</w:t>
+      </w:r>
+    </w:p>
+    <w:p>
+      <w:r>
+        <w:t>type commit</w:t>
+      </w:r>
+    </w:p>
+    <w:p>
+      <w:r>
+        <w:t>tag v1.0</w:t>
+      </w:r>
+    </w:p>
+    <w:p>
+      <w:r>
+        <w:t>tag Ian Bickford &lt;ian@example.com&gt;</w:t>
+      </w:r>
+    </w:p>
+    <w:p>
+      <w:r>
+        <w:t>date Thu Jul 23 14:00:00 2026 -0400</w:t>
+      </w:r>
+    </w:p>
+    <w:p/>
+    <w:p>
+      <w:r>
+        <w:t>Release version 1.0</w:t>
+      </w:r>
+    </w:p>
+    <w:p>
+      <w:r>
+        <w:t>“</w:t>
+      </w:r>
+    </w:p>
+    <w:p>
+      <w:r>
+        <w:t>Alternatively, you could instead use the command `git show v1.0`, which gives you similar information without needing to know the tag’s hash identifier.</w:t>
+      </w:r>
+    </w:p>
+    <w:p>
+      <w:r>
+        <w:t>The object line refers to object hash that this tag points to, the next line indicates the tag points to a commit object, the next line is the name of the tag, the next line is the author of the tag with their email, the next line is the exact time that the tag was created, and the final line indicates the message that was associated with the tag when being created with the -m flag.</w:t>
+      </w:r>
+    </w:p>
+    <w:p>
+      <w:pPr>
+        <w:pStyle w:val="Heading3"/>
+      </w:pPr>
+      <w:r>
+        <w:t>When Should You Use Each Type of Tag?</w:t>
+      </w:r>
+    </w:p>
+    <w:p>
+      <w:r>
+        <w:t>Lightweight tags are useful for when you simpl</w:t>
+      </w:r>
+      <w:r>
+        <w:t>y</w:t>
+      </w:r>
+      <w:r>
+        <w:t xml:space="preserve"> want to create a quick marker inside your local repository. They are often used for temporary references or personal bookmarks. In contrast, annotated tags are the preferred method for marking official releases because they contain important metadata about the release.</w:t>
+      </w:r>
+    </w:p>
+    <w:p>
+      <w:pPr>
+        <w:pBdr>
+          <w:bottom w:val="single" w:sz="12" w:space="1" w:color="auto"/>
+        </w:pBdr>
+      </w:pPr>
+    </w:p>
+    <w:p>
+      <w:pPr>
+        <w:pStyle w:val="Heading2"/>
+      </w:pPr>
+      <w:r>
+        <w:t>Detached HEAD State</w:t>
+      </w:r>
+    </w:p>
+    <w:p>
+      <w:r>
+        <w:t xml:space="preserve">As explained earlier, a detached HEAD state is when HEAD is directly referencing a commit. This means that HEAD is no longer attached </w:t>
+      </w:r>
+      <w:r>
+        <w:t xml:space="preserve">to </w:t>
+      </w:r>
+      <w:r>
+        <w:t>a branch, hence detached HEAD state.</w:t>
+      </w:r>
+    </w:p>
+    <w:p>
+      <w:r>
+        <w:t xml:space="preserve">We can enter a detached HEAD state by switching to a commit or tag by using the commands `git switch --detach {insert commit hash </w:t>
+      </w:r>
+      <w:proofErr w:type="gramStart"/>
+      <w:r>
+        <w:t>id}`</w:t>
+      </w:r>
+      <w:proofErr w:type="gramEnd"/>
+      <w:r>
+        <w:t xml:space="preserve"> or `git switch {insert tag </w:t>
+      </w:r>
+      <w:proofErr w:type="gramStart"/>
+      <w:r>
+        <w:t>name}`</w:t>
+      </w:r>
+      <w:proofErr w:type="gramEnd"/>
+      <w:r>
+        <w:t xml:space="preserve">. </w:t>
+      </w:r>
+    </w:p>
+    <w:p>
+      <w:r>
+        <w:lastRenderedPageBreak/>
+        <w:t xml:space="preserve">Being in a detached HEAD state is not inherently bad and it is </w:t>
+      </w:r>
+      <w:proofErr w:type="gramStart"/>
+      <w:r>
+        <w:t>actually fairly</w:t>
+      </w:r>
+      <w:proofErr w:type="gramEnd"/>
+      <w:r>
+        <w:t xml:space="preserve"> useful when inspecting old versions of code or testing and experimenting with previous versions of the code. </w:t>
+      </w:r>
+    </w:p>
+    <w:p>
+      <w:r>
+        <w:t>The danger</w:t>
+      </w:r>
+      <w:r>
+        <w:t xml:space="preserve"> of being in a detached HEAD state</w:t>
+      </w:r>
+      <w:r>
+        <w:t xml:space="preserve"> is when you start making commits without a branch.</w:t>
+      </w:r>
+      <w:r>
+        <w:t xml:space="preserve"> This is because any work that you commit while in a detached HEAD state is unreachable by normal branch navigation techniques when you switch back to a known branch within the repository. Why? This is because </w:t>
+      </w:r>
+      <w:r>
+        <w:t>commits are usually kept reachable through references such as branches and/or tags</w:t>
+      </w:r>
+      <w:r>
+        <w:t>.</w:t>
+      </w:r>
+      <w:r>
+        <w:t xml:space="preserve"> When HEAD is detached, new commits are only referenced through HEAD temporarily. Once you switch away from the detached HEAD state, no branch reference points to those commits, making them unreachable by typical branch navigation.</w:t>
+      </w:r>
+      <w:r>
+        <w:t xml:space="preserve"> </w:t>
+      </w:r>
+    </w:p>
+    <w:p>
+      <w:r>
+        <w:t xml:space="preserve">Is our work completely gone if we make commits in a detached HEAD state and then switch back to a known branch? </w:t>
+      </w:r>
+      <w:r>
+        <w:t>No, n</w:t>
+      </w:r>
+      <w:r>
+        <w:t>ot right away. Typically, Git’s garbage collector will eventually remove unreachable commits</w:t>
+      </w:r>
+      <w:r>
+        <w:t>.</w:t>
+      </w:r>
+      <w:r>
+        <w:t xml:space="preserve"> </w:t>
+      </w:r>
+      <w:r>
+        <w:t xml:space="preserve">The exact amount of time is determined by Git’s garbage collection and </w:t>
+      </w:r>
+      <w:proofErr w:type="spellStart"/>
+      <w:r>
+        <w:t>reflog</w:t>
+      </w:r>
+      <w:proofErr w:type="spellEnd"/>
+      <w:r>
+        <w:t xml:space="preserve"> expiration policies</w:t>
+      </w:r>
+      <w:r>
+        <w:t>.</w:t>
+      </w:r>
+      <w:r>
+        <w:t xml:space="preserve"> For reference </w:t>
+      </w:r>
+      <w:proofErr w:type="gramStart"/>
+      <w:r>
+        <w:t>on</w:t>
+      </w:r>
+      <w:proofErr w:type="gramEnd"/>
+      <w:r>
+        <w:t xml:space="preserve"> how much time you may have, I can still access HEAD states from months ago on this repository, but it may be different for you </w:t>
+      </w:r>
+      <w:proofErr w:type="gramStart"/>
+      <w:r>
+        <w:t>an</w:t>
+      </w:r>
+      <w:proofErr w:type="gramEnd"/>
+      <w:r>
+        <w:t xml:space="preserve"> it is important to recover any work you want to keep as soon as possible.</w:t>
+      </w:r>
+    </w:p>
+    <w:p>
+      <w:r>
+        <w:t xml:space="preserve">To do this we have </w:t>
+      </w:r>
+      <w:r>
+        <w:t>a couple of easy</w:t>
+      </w:r>
+      <w:r>
+        <w:t xml:space="preserve"> options. </w:t>
+      </w:r>
+    </w:p>
+    <w:p>
+      <w:pPr>
+        <w:pStyle w:val="Heading3"/>
+      </w:pPr>
+      <w:r>
+        <w:t>Method 1</w:t>
+      </w:r>
+    </w:p>
+    <w:p>
+      <w:r>
+        <w:t xml:space="preserve">In the first case, let’s assume that we are working in a detached HEAD state on an older commit and we start experimenting with some new innovations on our application stored in this project’s repository. We see that our experimental testing has some </w:t>
+      </w:r>
+      <w:proofErr w:type="gramStart"/>
+      <w:r>
+        <w:t>promise</w:t>
+      </w:r>
+      <w:proofErr w:type="gramEnd"/>
+      <w:r>
+        <w:t xml:space="preserve"> and we start creating some commits as restore points. After a couple of commits, we realize that </w:t>
+      </w:r>
+      <w:proofErr w:type="gramStart"/>
+      <w:r>
+        <w:t>are</w:t>
+      </w:r>
+      <w:proofErr w:type="gramEnd"/>
+      <w:r>
+        <w:t xml:space="preserve"> experimentation is a success and we want to keep these changes to be reviewed by the project manager later. If we have not left our detached </w:t>
+      </w:r>
+      <w:r>
+        <w:t>HEAD</w:t>
+      </w:r>
+      <w:r>
+        <w:t xml:space="preserve"> state, we can create a branch using the command `git switch -c {insert name of </w:t>
+      </w:r>
+      <w:proofErr w:type="gramStart"/>
+      <w:r>
+        <w:t>branch}`</w:t>
+      </w:r>
+      <w:proofErr w:type="gramEnd"/>
+      <w:r>
+        <w:t>. The -c flag just means we are creating a new branch. From here, we</w:t>
+      </w:r>
+      <w:r>
+        <w:t xml:space="preserve"> now have a reference to these commits via a </w:t>
+      </w:r>
+      <w:r>
+        <w:t>branch,</w:t>
+      </w:r>
+      <w:r>
+        <w:t xml:space="preserve"> </w:t>
+      </w:r>
+      <w:r>
+        <w:t>and the work is once again reachable by typical branch navigation techniques</w:t>
+      </w:r>
+      <w:r>
+        <w:t>.</w:t>
+      </w:r>
+    </w:p>
+    <w:p>
+      <w:pPr>
+        <w:pStyle w:val="Heading3"/>
+      </w:pPr>
+      <w:r>
+        <w:t>Method 2</w:t>
+      </w:r>
+    </w:p>
+    <w:p>
+      <w:r>
+        <w:t xml:space="preserve">In the next case, </w:t>
+      </w:r>
+      <w:r>
+        <w:t>let’s</w:t>
+      </w:r>
+      <w:r>
+        <w:t xml:space="preserve"> assume you switched back to the main branch and left the detached HEAD state when you had commits you wanted to keep. If we want to keep that work for future reference, we can use the command `git </w:t>
+      </w:r>
+      <w:proofErr w:type="spellStart"/>
+      <w:r>
+        <w:t>reflog</w:t>
+      </w:r>
+      <w:proofErr w:type="spellEnd"/>
+      <w:r>
+        <w:t xml:space="preserve">`. This command will show where HEAD has been recently. Using this command, we can see the commit hash identifier for the commits that are otherwise unreachable through branch navigation. We can then </w:t>
+      </w:r>
+      <w:r>
+        <w:lastRenderedPageBreak/>
+        <w:t xml:space="preserve">recover that work using `git switch -c {insert new branch name} {insert hash id for detached </w:t>
+      </w:r>
+      <w:proofErr w:type="gramStart"/>
+      <w:r>
+        <w:t>commit}`</w:t>
+      </w:r>
+      <w:proofErr w:type="gramEnd"/>
+      <w:r>
+        <w:t>. This creates a new branch with the given name of the new branch at the identifier for the commit that is in a detached state.</w:t>
+      </w:r>
     </w:p>
     <w:p/>
     <w:sectPr>
@@ -1470,7 +2676,6 @@
     <w:next w:val="Normal"/>
     <w:link w:val="Heading3Char"/>
     <w:uiPriority w:val="9"/>
-    <w:semiHidden/>
     <w:unhideWhenUsed/>
     <w:qFormat/>
     <w:rsid w:val="00AB28F2"/>
@@ -1622,7 +2827,6 @@
   <w:style w:type="character" w:default="1" w:styleId="DefaultParagraphFont">
     <w:name w:val="Default Paragraph Font"/>
     <w:uiPriority w:val="1"/>
-    <w:semiHidden/>
     <w:unhideWhenUsed/>
   </w:style>
   <w:style w:type="table" w:default="1" w:styleId="TableNormal">
@@ -1677,7 +2881,6 @@
     <w:basedOn w:val="DefaultParagraphFont"/>
     <w:link w:val="Heading3"/>
     <w:uiPriority w:val="9"/>
-    <w:semiHidden/>
     <w:rsid w:val="00AB28F2"/>
     <w:rPr>
       <w:rFonts w:eastAsiaTheme="majorEastAsia" w:cstheme="majorBidi"/>
@@ -1933,6 +3136,29 @@
       <w:smallCaps/>
       <w:color w:val="0F4761" w:themeColor="accent1" w:themeShade="BF"/>
       <w:spacing w:val="5"/>
+    </w:rPr>
+  </w:style>
+  <w:style w:type="character" w:styleId="Hyperlink">
+    <w:name w:val="Hyperlink"/>
+    <w:basedOn w:val="DefaultParagraphFont"/>
+    <w:uiPriority w:val="99"/>
+    <w:unhideWhenUsed/>
+    <w:rsid w:val="00D67739"/>
+    <w:rPr>
+      <w:color w:val="467886" w:themeColor="hyperlink"/>
+      <w:u w:val="single"/>
+    </w:rPr>
+  </w:style>
+  <w:style w:type="character" w:styleId="UnresolvedMention">
+    <w:name w:val="Unresolved Mention"/>
+    <w:basedOn w:val="DefaultParagraphFont"/>
+    <w:uiPriority w:val="99"/>
+    <w:semiHidden/>
+    <w:unhideWhenUsed/>
+    <w:rsid w:val="00D67739"/>
+    <w:rPr>
+      <w:color w:val="605E5C"/>
+      <w:shd w:val="clear" w:color="auto" w:fill="E1DFDD"/>
     </w:rPr>
   </w:style>
 </w:styles>

</xml_diff>